<commit_message>
docs: align residual Box Storage claims in architecture page and Hinglish docs with SHA-256 transaction attestation
</commit_message>
<xml_diff>
--- a/docs/ONE_PAGER_HINGLISH.docx
+++ b/docs/ONE_PAGER_HINGLISH.docx
@@ -348,7 +348,7 @@
         <w:br/>
         <w:t xml:space="preserve">                                                                    │</w:t>
         <w:br/>
-        <w:t xml:space="preserve">   [SHA-256 Box Storage Receipt] ◄── [Lute Wallet Signs $0.007] ◄───┘ (All Passed OK)</w:t>
+        <w:t xml:space="preserve">   [SHA-256 Attestation Receipt] ◄── [Lute Wallet Signs $0.007] ◄───┘ (All Passed OK)</w:t>
       </w:r>
     </w:p>
     <w:p>
@@ -386,7 +386,7 @@
         <w:rPr>
           <w:b/>
         </w:rPr>
-        <w:t>SHA-256 cryptographic digest</w:t>
+        <w:t>SHA-256 cryptographic attestation digest</w:t>
       </w:r>
       <w:r>
         <w:t xml:space="preserve"> (</w:t>
@@ -415,19 +415,30 @@
         <w:rPr>
           <w:b/>
         </w:rPr>
-        <w:t>PyTeal ARC-4 Smart Contract</w:t>
+        <w:t>Attestation Engine</w:t>
       </w:r>
       <w:r>
-        <w:t xml:space="preserve"> writes this hash to </w:t>
+        <w:t xml:space="preserve"> anchors this digest to the </w:t>
       </w:r>
       <w:r>
         <w:rPr>
           <w:b/>
         </w:rPr>
-        <w:t>Algorand Box Storage</w:t>
+        <w:t>Algorand payment transaction ID</w:t>
       </w:r>
       <w:r>
-        <w:t xml:space="preserve"> for permanent on-chain auditability.</w:t>
+        <w:t xml:space="preserve"> for permanent auditability. PyTeal Box Storage contract (</w:t>
+      </w:r>
+      <w:r>
+        <w:rPr>
+          <w:rFonts w:ascii="Consolas" w:hAnsi="Consolas"/>
+          <w:color w:val="0284C7"/>
+          <w:sz w:val="19"/>
+        </w:rPr>
+        <w:t>contracts/signal_attestation.py</w:t>
+      </w:r>
+      <w:r>
+        <w:t>) prepared for mainnet deployment.</w:t>
       </w:r>
     </w:p>
     <w:p>

</xml_diff>